<commit_message>
docs(experiments): rebuild v4 docx from verified sources
</commit_message>
<xml_diff>
--- a/docs/experiments/2026-07-05-model-comparison/model-comparison-experiment-v4.docx
+++ b/docs/experiments/2026-07-05-model-comparison/model-comparison-experiment-v4.docx
@@ -310,7 +310,7 @@
     </w:p>
     <w:p>
       <w:r>
-        <w:t>Воронка корпуса: 8 829 внутренних ссылок → 405 исключено хронофильтром → 6 без Wikidata-элемента → 7 959 эталонных упоминаний, 3 868 уникальных QID.</w:t>
+        <w:t>Воронка корпуса: 8 829 внутренних ссылок → 459 красных ссылок (red links) исключено → 405 исключено хронофильтром → 6 без Wikidata-элемента → 7 959 эталонных упоминаний, 3 868 уникальных QID.</w:t>
       </w:r>
     </w:p>
     <w:p>
@@ -1238,7 +1238,7 @@
     </w:tbl>
     <w:p>
       <w:r>
-        <w:t>Зазор R_doc − R_strict около 0.08–0.10. Это цена позиционной строгости: границы многословных упоминаний и повторные упоминания в другом месте статьи.</w:t>
+        <w:t>Зазор R_doc − R_strict около 0.08–0.11. Это цена позиционной строгости: границы многословных упоминаний и повторные упоминания в другом месте статьи.</w:t>
       </w:r>
     </w:p>
     <w:p>
@@ -1457,7 +1457,7 @@
     </w:tbl>
     <w:p>
       <w:r>
-        <w:t xml:space="preserve">Точность grounding идентична. Модели различаются только покрытием NER-стадии. Числа 0.92 и 0.85 показывают точность внутри успешных путей разрешения. Сквозная точность 0.81 ниже из-за явных отказных путей, это 7–8 % покрытых позиций. Разрез по типу упоминания (R_doc): именованные 0.828, нарицательные 0.414 у gemini (0.733 и 0.376 у deepseek). Здесь тот же документный режим сопоставления, что и в основной метрике. </w:t>
+        <w:t xml:space="preserve">Точность grounding идентична. Модели различаются только покрытием NER-стадии. Числа 0.92 и 0.85 показывают точность внутри успешных путей разрешения. Сквозная точность 0.81 ниже из-за явных отказных путей, это 7–9 % покрытых позиций. Разрез по типу упоминания (R_doc): именованные 0.828, нарицательные 0.414 у gemini (0.733 и 0.376 у deepseek). Здесь тот же документный режим сопоставления, что и в основной метрике. </w:t>
       </w:r>
       <w:r>
         <w:rPr>
@@ -2726,7 +2726,7 @@
     </w:p>
     <w:p>
       <w:r>
-        <w:t>Несколько независимых признаков указывают на инфраструктурную причину, а не на качество модели. Число предсказаний на статью повторяет хронологию отказа. У первых 30 обработанных статей в среднем 39.6 предсказаний на статью, у последних 30, обработанных уже после стабилизации маршрута, 136.9. Статья «Яффа», целиком обработанная сегодня, дала 1 168 предсказаний. Это больше, чем 1 044 у gemini на той же статье. Там, где маршрут к провайдеру не был повреждён, qwen извлекает не хуже gemini и даже богаче. Форензический R_doc по сохранившимся предсказаниям qwen равен 0.164, при этом точность по стратам 0.87–0.98. Там, где модель успела отработать, она точна. Итоговый recall занижен пропущенным покрытием, а не качеством модели.</w:t>
+        <w:t>Несколько независимых признаков указывают на инфраструктурную причину, а не на качество модели. Число предсказаний на статью повторяет хронологию отказа. У первых 30 обработанных статей в среднем 39.6 предсказаний на статью, у последних 30, обработанных уже после стабилизации маршрута, 136.9. Статья «Яффа», целиком обработанная сегодня, дала 1 168 предсказаний. Это больше, чем 1 044 у gemini на той же статье. Там, где маршрут к провайдеру не был повреждён, qwen извлекает не хуже gemini и даже богаче. Форензический R_doc по сохранившимся предсказаниям qwen равен 0.164, при этом точность по стратам 0.84–0.98. Там, где модель успела отработать, она точна. Итоговый recall занижен пропущенным покрытием, а не качеством модели.</w:t>
       </w:r>
     </w:p>
     <w:p>
@@ -3042,7 +3042,7 @@
         <w:t>instance-of</w:t>
       </w:r>
       <w:r>
-        <w:t xml:space="preserve"> class), which annotate temporal navigation rather than terminology. The corpus of 100 articles yields 8,829 in-text links; 405 are chronology-filtered and 6 carry no Wikidata item, leaving </w:t>
+        <w:t xml:space="preserve"> class), which annotate temporal navigation rather than terminology. The corpus of 100 articles yields 8,829 in-text links; 459 point to red links, 405 are chronology-filtered, and 6 carry no Wikidata item, leaving </w:t>
       </w:r>
       <w:r>
         <w:rPr>
@@ -3639,10 +3639,10 @@
         <w:rPr>
           <w:b/>
         </w:rPr>
-        <w:t>0.814 and 0.815, identical to the third decimal</w:t>
-      </w:r>
-      <w:r>
-        <w:t>. The entire recall difference lives in the extraction stage. Given a mention, both models ground it about equally well, and well in absolute terms: accuracy runs 0.92–0.93 on the deterministic exact-label path and 0.85–0.86 on judge-disambiguated cases, with the residual conditional loss concentrated in explicit abstentions, roughly 7–8% of covered positions. This is the result to carry out of the section. The bottleneck is finding the terms, not linking them.</w:t>
+        <w:t>0.814 and 0.815, identical to the second decimal</w:t>
+      </w:r>
+      <w:r>
+        <w:t>. The entire recall difference lives in the extraction stage. Given a mention, both models ground it about equally well, and well in absolute terms: accuracy runs 0.92–0.93 on the deterministic exact-label path and 0.85–0.86 on judge-disambiguated cases, with the residual conditional loss concentrated in explicit abstentions, roughly 7–9% of covered positions. This is the result to carry out of the section. The bottleneck is finding the terms, not linking them.</w:t>
       </w:r>
     </w:p>
     <w:p>

</xml_diff>